<commit_message>
refactor: rename evaluation to audit terminology across documentation and kuesioner scripts
</commit_message>
<xml_diff>
--- a/TUGAS-4-PROJECT-AUDIT-SI/02_Laporan/Kelompok-Laporan-Audit-SI-PT_Aegisindo_Mitra_Sejati.docx
+++ b/TUGAS-4-PROJECT-AUDIT-SI/02_Laporan/Kelompok-Laporan-Audit-SI-PT_Aegisindo_Mitra_Sejati.docx
@@ -81,7 +81,7 @@
           <w:b/>
           <w:sz w:val="28"/>
         </w:rPr>
-        <w:t>EVALUASI TATA KELOLA TEKNOLOGI INFORMASI</w:t>
+        <w:t>AUDIT TATA KELOLA TEKNOLOGI INFORMASI</w:t>
       </w:r>
     </w:p>
     <w:p>
@@ -351,7 +351,7 @@
           <w:i w:val="0"/>
           <w:sz w:val="24"/>
         </w:rPr>
-        <w:t>Laporan ini membahas evaluasi tata kelola teknologi informasi pada PT Aegisindo Mitra Sejati menggunakan framework COBIT 2019. Melalui audit ini, kami melakukan penilaian terhadap tingkat kapabilitas (capability level) tata kelola TI pada lima domain yang relevan dengan kondisi perusahaan, yaitu APO14 (Managed Data), BAI09 (Managed Assets), DSS01 (Managed Operations), DSS04 (Managed Continuity), dan DSS05 (Managed Security Services).</w:t>
+        <w:t>Laporan ini membahas audit tata kelola teknologi informasi pada PT Aegisindo Mitra Sejati menggunakan framework COBIT 2019. Melalui audit ini, kami melakukan penilaian terhadap tingkat kapabilitas (capability level) tata kelola TI pada lima domain yang relevan dengan kondisi perusahaan, yaitu APO14 (Managed Data), BAI09 (Managed Assets), DSS01 (Managed Operations), DSS04 (Managed Continuity), dan DSS05 (Managed Security Services).</w:t>
       </w:r>
     </w:p>
     <w:p>

</xml_diff>